<commit_message>
Rename StratOS to the Strat-IQ Toolkit and relicense: PolyForm Noncommercial (code) and CC BY-NC 4.0 (content)
Skill IDs move from stratos-* to stratiq-*. Commercial licences: BScheller@ToolsIQ.ai.

Co-Authored-By: Claude Opus 5.5 <noreply@anthropic.com>
Claude-Session: https://claude.ai/code/session_01X5wRPLvDNAfKFFNbzhL7V8
</commit_message>
<xml_diff>
--- a/demo/Demo_Run_Sheet.docx
+++ b/demo/Demo_Run_Sheet.docx
@@ -7,7 +7,7 @@
         <w:pStyle w:val="Title"/>
       </w:pPr>
       <w:r>
-        <w:t xml:space="preserve">StratOS</w:t>
+        <w:t xml:space="preserve">Strat-IQ</w:t>
       </w:r>
       <w:r>
         <w:t xml:space="preserve"> </w:t>
@@ -75,7 +75,7 @@
         <w:t xml:space="preserve"> </w:t>
       </w:r>
       <w:r>
-        <w:t xml:space="preserve">StratOS</w:t>
+        <w:t xml:space="preserve">Strat-IQ</w:t>
       </w:r>
       <w:r>
         <w:t xml:space="preserve"> </w:t>
@@ -156,7 +156,7 @@
         <w:pStyle w:val="Compact"/>
       </w:pPr>
       <w:r>
-        <w:t xml:space="preserve">Upload the 29 v3 skill zips to the Claude account you will record from and switch them on (Settings → Capabilities → Skills). Switch off the Part 1</w:t>
+        <w:t xml:space="preserve">On the Claude account you will record from, delete any old</w:t>
       </w:r>
       <w:r>
         <w:t xml:space="preserve"> </w:t>
@@ -165,10 +165,28 @@
         <w:rPr>
           <w:rStyle w:val="VerbatimChar"/>
         </w:rPr>
-        <w:t xml:space="preserve">stratos-orchestrator</w:t>
-      </w:r>
-      <w:r>
-        <w:t xml:space="preserve">. You should see 39 StratOS skills on.</w:t>
+        <w:t xml:space="preserve">stratos-</w:t>
+      </w:r>
+      <w:r>
+        <w:t xml:space="preserve"> </w:t>
+      </w:r>
+      <w:r>
+        <w:t xml:space="preserve">skills, then upload the 40 zips inside</w:t>
+      </w:r>
+      <w:r>
+        <w:t xml:space="preserve"> </w:t>
+      </w:r>
+      <w:r>
+        <w:rPr>
+          <w:rStyle w:val="VerbatimChar"/>
+        </w:rPr>
+        <w:t xml:space="preserve">stratiq-toolkit-skills.zip</w:t>
+      </w:r>
+      <w:r>
+        <w:t xml:space="preserve"> </w:t>
+      </w:r>
+      <w:r>
+        <w:t xml:space="preserve">(Settings → Capabilities → Skills). You should see 40 Strat-IQ skills on.</w:t>
       </w:r>
     </w:p>
     <w:p>
@@ -190,7 +208,7 @@
           <w:bCs/>
           <w:b/>
         </w:rPr>
-        <w:t xml:space="preserve">StratOS Demo: EV</w:t>
+        <w:t xml:space="preserve">Strat-IQ Demo: EV</w:t>
       </w:r>
       <w:r>
         <w:t xml:space="preserve">. Add to its knowledge:</w:t>
@@ -256,7 +274,7 @@
         <w:rPr>
           <w:rStyle w:val="VerbatimChar"/>
         </w:rPr>
-        <w:t xml:space="preserve">StratOS_Workbook_demo.xlsx</w:t>
+        <w:t xml:space="preserve">StratIQ_Workbook_demo.xlsx</w:t>
       </w:r>
       <w:r>
         <w:t xml:space="preserve"> </w:t>
@@ -517,7 +535,7 @@
                 <w:rFonts w:ascii="Arial" w:hAnsi="Arial"/>
                 <w:sz w:val="19"/>
               </w:rPr>
-              <w:t xml:space="preserve">Run StratOS</w:t>
+              <w:t xml:space="preserve">Run Strat-IQ</w:t>
             </w:r>
             <w:r>
               <w:rPr>
@@ -1091,7 +1109,7 @@
       </w:tr>
     </w:tbl>
     <w:bookmarkEnd w:id="20"/>
-    <w:bookmarkStart w:id="21" w:name="demo-1.-resume-with-run-stratos"/>
+    <w:bookmarkStart w:id="21" w:name="demo-1.-resume-with-run-strat-iq"/>
     <w:p>
       <w:pPr>
         <w:pStyle w:val="Heading1"/>
@@ -1106,7 +1124,7 @@
         <w:t xml:space="preserve">“</w:t>
       </w:r>
       <w:r>
-        <w:t xml:space="preserve">Run StratOS</w:t>
+        <w:t xml:space="preserve">Run Strat-IQ</w:t>
       </w:r>
       <w:r>
         <w:t xml:space="preserve">”</w:t>
@@ -1127,7 +1145,7 @@
         <w:t xml:space="preserve"> </w:t>
       </w:r>
       <w:r>
-        <w:t xml:space="preserve">the ledger carries the work across chats; StratOS checks what is done and continues.</w:t>
+        <w:t xml:space="preserve">the ledger carries the work across chats; Strat-IQ checks what is done and continues.</w:t>
       </w:r>
     </w:p>
     <w:p>
@@ -1145,7 +1163,7 @@
         <w:t xml:space="preserve"> </w:t>
       </w:r>
       <w:r>
-        <w:t xml:space="preserve">new chat inside the StratOS Demo: EV Project.</w:t>
+        <w:t xml:space="preserve">new chat inside the Strat-IQ Demo: EV Project.</w:t>
       </w:r>
     </w:p>
     <w:p>
@@ -1169,7 +1187,7 @@
         <w:rPr>
           <w:rStyle w:val="VerbatimChar"/>
         </w:rPr>
-        <w:t xml:space="preserve">Run StratOS</w:t>
+        <w:t xml:space="preserve">Run Strat-IQ</w:t>
       </w:r>
     </w:p>
     <w:p>
@@ -1187,7 +1205,7 @@
         <w:t xml:space="preserve"> </w:t>
       </w:r>
       <w:r>
-        <w:t xml:space="preserve">StratOS finds</w:t>
+        <w:t xml:space="preserve">Strat-IQ finds</w:t>
       </w:r>
       <w:r>
         <w:t xml:space="preserve"> </w:t>
@@ -2900,7 +2918,7 @@
           <w:bCs/>
           <w:b/>
         </w:rPr>
-        <w:t xml:space="preserve">StratOS_Workbook_demo.xlsx</w:t>
+        <w:t xml:space="preserve">StratIQ_Workbook_demo.xlsx</w:t>
       </w:r>
       <w:r>
         <w:rPr>
@@ -2997,7 +3015,7 @@
         <w:t xml:space="preserve">“</w:t>
       </w:r>
       <w:r>
-        <w:t xml:space="preserve">Two digits swapped. That typo would have priced us out of North America for a year. The check took a minute. StratOS never changed the entry; we fix it ourselves in GLO-BUS.</w:t>
+        <w:t xml:space="preserve">Two digits swapped. That typo would have priced us out of North America for a year. The check took a minute. Strat-IQ never changed the entry; we fix it ourselves in GLO-BUS.</w:t>
       </w:r>
       <w:r>
         <w:t xml:space="preserve">”</w:t>
@@ -3028,7 +3046,7 @@
         <w:t xml:space="preserve"> </w:t>
       </w:r>
       <w:r>
-        <w:t xml:space="preserve">live formulas, the Risk Analysis sheet and the Tracking charts.</w:t>
+        <w:t xml:space="preserve">live formulas, the Risk Analysis sheet, Season by Year and the KPI Charts.</w:t>
       </w:r>
     </w:p>
     <w:p>
@@ -3052,7 +3070,7 @@
         <w:rPr>
           <w:rStyle w:val="VerbatimChar"/>
         </w:rPr>
-        <w:t xml:space="preserve">Build our StratOS workbook from the ledger with our Year 6 and Year 7 GLO-BUS captures.</w:t>
+        <w:t xml:space="preserve">Build our Strat-IQ workbook from the ledger with our Year 6 and Year 7 GLO-BUS captures.</w:t>
       </w:r>
     </w:p>
     <w:p>
@@ -3168,13 +3186,48 @@
           <w:bCs/>
           <w:b/>
         </w:rPr>
-        <w:t xml:space="preserve">Tracking</w:t>
-      </w:r>
-      <w:r>
-        <w:t xml:space="preserve"> </w:t>
-      </w:r>
-      <w:r>
-        <w:t xml:space="preserve">tab. EPS rose from $1.85 to $2.10 but stayed under the investor expectation ($2.00, then $2.15); the credit rating improved from B+ to BB-.</w:t>
+        <w:t xml:space="preserve">Season by Year</w:t>
+      </w:r>
+      <w:r>
+        <w:t xml:space="preserve"> </w:t>
+      </w:r>
+      <w:r>
+        <w:t xml:space="preserve">tab. Scroll right: each year has its value and its change (▲ ▼). EPS rose from $1.85 to $2.10 but stayed under the investor expectation ($2.00, then $2.15); the credit rating improved from B+ to BB-.</w:t>
+      </w:r>
+    </w:p>
+    <w:p>
+      <w:pPr>
+        <w:numPr>
+          <w:ilvl w:val="0"/>
+          <w:numId w:val="1005"/>
+        </w:numPr>
+        <w:pStyle w:val="Compact"/>
+      </w:pPr>
+      <w:r>
+        <w:rPr>
+          <w:bCs/>
+          <w:b/>
+        </w:rPr>
+        <w:t xml:space="preserve">KPI Charts</w:t>
+      </w:r>
+      <w:r>
+        <w:t xml:space="preserve"> </w:t>
+      </w:r>
+      <w:r>
+        <w:t xml:space="preserve">and</w:t>
+      </w:r>
+      <w:r>
+        <w:t xml:space="preserve"> </w:t>
+      </w:r>
+      <w:r>
+        <w:rPr>
+          <w:bCs/>
+          <w:b/>
+        </w:rPr>
+        <w:t xml:space="preserve">Competition by Year</w:t>
+      </w:r>
+      <w:r>
+        <w:t xml:space="preserve">: the trends in graphs, and every company’s score and rank by year.</w:t>
       </w:r>
     </w:p>
     <w:p>
@@ -3591,7 +3644,7 @@
                 <w:rFonts w:ascii="Arial" w:hAnsi="Arial"/>
                 <w:sz w:val="19"/>
               </w:rPr>
-              <w:t xml:space="preserve">Demo 9 (results tabs and Tracking)</w:t>
+              <w:t xml:space="preserve">Demo 9 (Season by Year, Competition by Year, KPI Charts) and the weekly review</w:t>
             </w:r>
           </w:p>
         </w:tc>
@@ -3645,7 +3698,7 @@
                 <w:rFonts w:ascii="Arial" w:hAnsi="Arial"/>
                 <w:sz w:val="19"/>
               </w:rPr>
-              <w:t xml:space="preserve">StratOS_Workbook_demo.xlsx</w:t>
+              <w:t xml:space="preserve">StratIQ_Workbook_demo.xlsx</w:t>
             </w:r>
           </w:p>
         </w:tc>
@@ -3672,7 +3725,7 @@
         <w:pStyle w:val="BodyText"/>
       </w:pPr>
       <w:r>
-        <w:t xml:space="preserve">© 2026 G. Bradley Scheller · StratOS Strategy Lab</w:t>
+        <w:t xml:space="preserve">© 2026 G. Bradley Scheller · Strat-IQ Toolkit</w:t>
       </w:r>
     </w:p>
     <w:bookmarkEnd w:id="30"/>

</xml_diff>